<commit_message>
Refine Syneos #066 resume wording
</commit_message>
<xml_diff>
--- a/output/cv-alanis-sun-syneos-health-sr-project-specialist-25112895-2026-09-29.docx
+++ b/output/cv-alanis-sun-syneos-health-sr-project-specialist-25112895-2026-09-29.docx
@@ -65,7 +65,7 @@
           <w:rFonts w:ascii="Arial" w:hAnsi="Arial"/>
           <w:sz w:val="18"/>
         </w:rPr>
-        <w:t xml:space="preserve">Clinical-development professional with more than six years supporting Phase I/II research in a GLP biotech environment, combining clinical-sample traceability, regulated documentation, CRO/internal coordination, and discrepancy resolution with project planning, status tracking, and cross-functional follow-through. Experienced in ASCVD clinical-development support and academic oncology research, and seeking to transition into formal clinical project/study operations.</w:t>
+        <w:t xml:space="preserve">Clinical-development professional with more than six years supporting Phase I/II research in a GLP biotech environment, combining clinical-sample traceability, regulated documentation, CRO/internal coordination, and discrepancy resolution with project planning, status tracking, and cross-functional follow-through. Experienced in ASCVD clinical-development support and academic oncology research, with a focus on expanding into clinical project and study operations.</w:t>
       </w:r>
     </w:p>
     <w:p>
@@ -608,7 +608,7 @@
           <w:rFonts w:ascii="Arial" w:hAnsi="Arial"/>
           <w:sz w:val="18"/>
         </w:rPr>
-        <w:t xml:space="preserve"> ClickUp, Smartsheet, Asana, Excel, GraphPad Prism, Benchling, SharePoint, Microsoft Teams, REDCap (independent simulation)</w:t>
+        <w:t xml:space="preserve"> ClickUp, Smartsheet, Asana, Excel, GraphPad Prism, Benchling, SharePoint, Microsoft Teams, Notion, REDCap (independent simulation)</w:t>
       </w:r>
     </w:p>
     <w:p>

</xml_diff>

<commit_message>
Expand Syneos #066 Vaxxinity evidence
</commit_message>
<xml_diff>
--- a/output/cv-alanis-sun-syneos-health-sr-project-specialist-25112895-2026-09-29.docx
+++ b/output/cv-alanis-sun-syneos-health-sr-project-specialist-25112895-2026-09-29.docx
@@ -1,6 +1,6 @@
 
 <file path=word/document.xml><?xml version="1.0" encoding="utf-8"?>
-<w:document xmlns:w="http://schemas.openxmlformats.org/wordprocessingml/2006/main" xmlns:r="http://schemas.openxmlformats.org/officeDocument/2006/relationships">
+<w:document xmlns:r="http://schemas.openxmlformats.org/officeDocument/2006/relationships" xmlns:w="http://schemas.openxmlformats.org/wordprocessingml/2006/main">
   <w:body>
     <w:p>
       <w:pPr>
@@ -259,7 +259,7 @@
           <w:rFonts w:ascii="Arial" w:hAnsi="Arial"/>
           <w:sz w:val="18"/>
         </w:rPr>
-        <w:t xml:space="preserve">Supported Phase I/II clinical bioanalytical work in a GLP environment, including assay optimization/validation, QC, testing, data analysis, and CRO results/documentation transfer; also supported ASCVD clinical development.</w:t>
+        <w:t xml:space="preserve">Supported Phase I/II clinical-development programs in a GLP environment through bioanalytical study work, and supported ASCVD clinical development.</w:t>
       </w:r>
     </w:p>
     <w:p>
@@ -304,6 +304,28 @@
           <w:sz w:val="18"/>
         </w:rPr>
         <w:t xml:space="preserve">Investigated CRO calculation/data discrepancies and coordinated assigned technical issues with CRO data teams, internal clinical colleagues, sample-management personnel, and supervisors through corrected-output review.</w:t>
+      </w:r>
+    </w:p>
+    <w:p>
+      <w:pPr>
+        <w:spacing w:after="35"/>
+        <w:keepLines/>
+        <w:ind w:left="240" w:hanging="160"/>
+      </w:pPr>
+      <w:r>
+        <w:rPr>
+          <w:rFonts w:ascii="Arial" w:hAnsi="Arial"/>
+          <w:sz w:val="18"/>
+          <w:b/>
+        </w:rPr>
+        <w:t>• </w:t>
+      </w:r>
+      <w:r>
+        <w:rPr>
+          <w:rFonts w:ascii="Arial" w:hAnsi="Arial"/>
+          <w:sz w:val="18"/>
+        </w:rPr>
+        <w:t xml:space="preserve">Prepared assigned assay-result/data-transfer deliverables and supporting documentation for CRO data teams; reviewed underlying data and records to support discrepancy follow-through with internal clinical colleagues.</w:t>
       </w:r>
     </w:p>
     <w:p>

</xml_diff>